<commit_message>
Completed Stock Trading App
</commit_message>
<xml_diff>
--- a/MERN Phase Wise/Phase Wise Templets/Brainstorming & Ideation Phase/Brainstorming- Idea Generation- Prioritizaation Template.docx
+++ b/MERN Phase Wise/Phase Wise Templets/Brainstorming & Ideation Phase/Brainstorming- Idea Generation- Prioritizaation Template.docx
@@ -179,7 +179,22 @@
           </w:tcPr>
           <w:p>
             <w:r>
-              <w:t>SB Stocks – Virtual Stock Trading Platform</w:t>
+              <w:t>S</w:t>
+            </w:r>
+            <w:r>
+              <w:t>tock</w:t>
+            </w:r>
+            <w:r>
+              <w:t xml:space="preserve"> T</w:t>
+            </w:r>
+            <w:r>
+              <w:t>rading</w:t>
+            </w:r>
+            <w:r>
+              <w:t xml:space="preserve"> A</w:t>
+            </w:r>
+            <w:r>
+              <w:t>pp</w:t>
             </w:r>
           </w:p>
         </w:tc>
@@ -396,7 +411,15 @@
         </w:numPr>
       </w:pPr>
       <w:r>
-        <w:t>Admin dashboard: stats, user list, stock catalog, orders, transactions</w:t>
+        <w:t xml:space="preserve">Admin dashboard: stats, user list, stock </w:t>
+      </w:r>
+      <w:proofErr w:type="spellStart"/>
+      <w:r>
+        <w:t>catalog</w:t>
+      </w:r>
+      <w:proofErr w:type="spellEnd"/>
+      <w:r>
+        <w:t>, orders, transactions</w:t>
       </w:r>
     </w:p>
     <w:p>
@@ -418,7 +441,15 @@
         </w:numPr>
       </w:pPr>
       <w:r>
-        <w:t>Password hashing (bcrypt) for account security</w:t>
+        <w:t>Password hashing (</w:t>
+      </w:r>
+      <w:proofErr w:type="spellStart"/>
+      <w:r>
+        <w:t>bcrypt</w:t>
+      </w:r>
+      <w:proofErr w:type="spellEnd"/>
+      <w:r>
+        <w:t>) for account security</w:t>
       </w:r>
     </w:p>
     <w:p>
@@ -796,7 +827,15 @@
           </w:tcPr>
           <w:p>
             <w:r>
-              <w:t>Live stock prices (Finnhub API)</w:t>
+              <w:t>Live stock prices (</w:t>
+            </w:r>
+            <w:proofErr w:type="spellStart"/>
+            <w:r>
+              <w:t>Finnhub</w:t>
+            </w:r>
+            <w:proofErr w:type="spellEnd"/>
+            <w:r>
+              <w:t xml:space="preserve"> API)</w:t>
             </w:r>
           </w:p>
         </w:tc>

</xml_diff>